<commit_message>
Update sales one-pager and add full features catalog (docx/pdf)
The one-pager was stale (missing teams, marketplace, gamification,
scheduled messages). Refreshed it and added a separate exhaustive
catalog covering every section of the app, in both Word and PDF.

Co-Authored-By: Claude Sonnet 5 <noreply@anthropic.com>
</commit_message>
<xml_diff>
--- a/PanelFit - Funcionalidades.docx
+++ b/PanelFit - Funcionalidades.docx
@@ -125,7 +125,7 @@
           <w:sz w:val="22"/>
           <w:szCs w:val="22"/>
         </w:rPr>
-        <w:t xml:space="preserve">organiza a tus clientes por situación (lesión, nuevo alta...) o por colectivo (un reto, una fase de entrenamiento).</w:t>
+        <w:t xml:space="preserve">organiza a tus clientes por situación (lesión, nuevo alta...) o en cohortes con su propia tabla de clasificación.</w:t>
       </w:r>
     </w:p>
     <w:p>
@@ -151,7 +151,33 @@
           <w:sz w:val="22"/>
           <w:szCs w:val="22"/>
         </w:rPr>
-        <w:t xml:space="preserve">agenda tus citas presenciales u online con cada cliente.</w:t>
+        <w:t xml:space="preserve">agenda tus citas presenciales u online con cada cliente, con recurrencia semanal automática.</w:t>
+      </w:r>
+    </w:p>
+    <w:p>
+      <w:pPr>
+        <w:pStyle w:val="ListParagraph"/>
+        <w:numPr>
+          <w:ilvl w:val="0"/>
+          <w:numId w:val="2"/>
+        </w:numPr>
+        <w:spacing w:after="80"/>
+      </w:pPr>
+      <w:r>
+        <w:rPr>
+          <w:b/>
+          <w:bCs/>
+          <w:sz w:val="22"/>
+          <w:szCs w:val="22"/>
+        </w:rPr>
+        <w:t xml:space="preserve">Equipos de entrenadores: </w:t>
+      </w:r>
+      <w:r>
+        <w:rPr>
+          <w:sz w:val="22"/>
+          <w:szCs w:val="22"/>
+        </w:rPr>
+        <w:t xml:space="preserve">suma a otros coaches a tu cuenta para repartir la gestión de clientes.</w:t>
       </w:r>
     </w:p>
     <w:p>
@@ -289,7 +315,7 @@
           <w:sz w:val="22"/>
           <w:szCs w:val="22"/>
         </w:rPr>
-        <w:t xml:space="preserve">EMOM, AMRAP, Tabata y circuitos reutilizables para añadir a cualquier semana.</w:t>
+        <w:t xml:space="preserve">EMOM, AMRAP, Tabata, For Time y circuitos reutilizables para añadir a cualquier semana.</w:t>
       </w:r>
     </w:p>
     <w:p>
@@ -315,7 +341,7 @@
           <w:sz w:val="22"/>
           <w:szCs w:val="22"/>
         </w:rPr>
-        <w:t xml:space="preserve">guarda tus rutinas favoritas y reutilízalas con cualquier cliente; compártelas con otros entrenadores si quieres.</w:t>
+        <w:t xml:space="preserve">guarda tus rutinas favoritas y publícalas en el marketplace para que cualquier entrenador de PanelFit las use.</w:t>
       </w:r>
     </w:p>
     <w:p>
@@ -349,7 +375,7 @@
           <w:sz w:val="22"/>
           <w:szCs w:val="22"/>
         </w:rPr>
-        <w:t xml:space="preserve">evolución del peso, 1RM estimado y marcas personales por ejercicio.</w:t>
+        <w:t xml:space="preserve">evolución del peso, 1RM estimado, marcas personales y estándares de fuerza por peso corporal.</w:t>
       </w:r>
     </w:p>
     <w:p>
@@ -394,14 +420,14 @@
           <w:sz w:val="22"/>
           <w:szCs w:val="22"/>
         </w:rPr>
-        <w:t xml:space="preserve">Fotos, peso corporal y medidas: </w:t>
-      </w:r>
-      <w:r>
-        <w:rPr>
-          <w:sz w:val="22"/>
-          <w:szCs w:val="22"/>
-        </w:rPr>
-        <w:t xml:space="preserve">evolución visual y numérica completa.</w:t>
+        <w:t xml:space="preserve">Valoraciones físicas completas: </w:t>
+      </w:r>
+      <w:r>
+        <w:rPr>
+          <w:sz w:val="22"/>
+          <w:szCs w:val="22"/>
+        </w:rPr>
+        <w:t xml:space="preserve">peso, grasa corporal, masa muscular y perímetros, con histórico.</w:t>
       </w:r>
     </w:p>
     <w:p>
@@ -427,7 +453,7 @@
           <w:sz w:val="22"/>
           <w:szCs w:val="22"/>
         </w:rPr>
-        <w:t xml:space="preserve">el cliente grava su ejecución de un ejercicio y tú respondes con texto o con tu propio vídeo corrigiendo la técnica.</w:t>
+        <w:t xml:space="preserve">el cliente graba su ejecución de un ejercicio y tú respondes con texto o con tu propio vídeo corrigiendo la técnica.</w:t>
       </w:r>
     </w:p>
     <w:p>
@@ -566,6 +592,32 @@
           <w:sz w:val="22"/>
           <w:szCs w:val="22"/>
         </w:rPr>
+        <w:t xml:space="preserve">Mensajes programados: </w:t>
+      </w:r>
+      <w:r>
+        <w:rPr>
+          <w:sz w:val="22"/>
+          <w:szCs w:val="22"/>
+        </w:rPr>
+        <w:t xml:space="preserve">agenda hoy un mensaje para que salga en la fecha que quieras — tu cliente recibe la notificación en el momento, sin que tengas que acordarte.</w:t>
+      </w:r>
+    </w:p>
+    <w:p>
+      <w:pPr>
+        <w:pStyle w:val="ListParagraph"/>
+        <w:numPr>
+          <w:ilvl w:val="0"/>
+          <w:numId w:val="2"/>
+        </w:numPr>
+        <w:spacing w:after="80"/>
+      </w:pPr>
+      <w:r>
+        <w:rPr>
+          <w:b/>
+          <w:bCs/>
+          <w:sz w:val="22"/>
+          <w:szCs w:val="22"/>
+        </w:rPr>
         <w:t xml:space="preserve">Notificaciones automáticas: </w:t>
       </w:r>
       <w:r>
@@ -600,6 +652,92 @@
           <w:szCs w:val="22"/>
         </w:rPr>
         <w:t xml:space="preserve">check-ins semanales o mensuales automáticos para no perder el contacto con nadie.</w:t>
+      </w:r>
+    </w:p>
+    <w:p>
+      <w:pPr>
+        <w:pStyle w:val="Heading1"/>
+      </w:pPr>
+      <w:r>
+        <w:t xml:space="preserve">Motivación y comunidad</w:t>
+      </w:r>
+    </w:p>
+    <w:p>
+      <w:pPr>
+        <w:pStyle w:val="ListParagraph"/>
+        <w:numPr>
+          <w:ilvl w:val="0"/>
+          <w:numId w:val="2"/>
+        </w:numPr>
+        <w:spacing w:after="80"/>
+      </w:pPr>
+      <w:r>
+        <w:rPr>
+          <w:b/>
+          <w:bCs/>
+          <w:sz w:val="22"/>
+          <w:szCs w:val="22"/>
+        </w:rPr>
+        <w:t xml:space="preserve">Insignias y rachas: </w:t>
+      </w:r>
+      <w:r>
+        <w:rPr>
+          <w:sz w:val="22"/>
+          <w:szCs w:val="22"/>
+        </w:rPr>
+        <w:t xml:space="preserve">hitos automáticos por constancia que mantienen a tus clientes enganchados.</w:t>
+      </w:r>
+    </w:p>
+    <w:p>
+      <w:pPr>
+        <w:pStyle w:val="ListParagraph"/>
+        <w:numPr>
+          <w:ilvl w:val="0"/>
+          <w:numId w:val="2"/>
+        </w:numPr>
+        <w:spacing w:after="80"/>
+      </w:pPr>
+      <w:r>
+        <w:rPr>
+          <w:b/>
+          <w:bCs/>
+          <w:sz w:val="22"/>
+          <w:szCs w:val="22"/>
+        </w:rPr>
+        <w:t xml:space="preserve">Reacciones de sesión: </w:t>
+      </w:r>
+      <w:r>
+        <w:rPr>
+          <w:sz w:val="22"/>
+          <w:szCs w:val="22"/>
+        </w:rPr>
+        <w:t xml:space="preserve">al terminar cada entreno, el cliente reacciona con un emoji y un comentario corto — feedback instantáneo, sin fricción.</w:t>
+      </w:r>
+    </w:p>
+    <w:p>
+      <w:pPr>
+        <w:pStyle w:val="ListParagraph"/>
+        <w:numPr>
+          <w:ilvl w:val="0"/>
+          <w:numId w:val="2"/>
+        </w:numPr>
+        <w:spacing w:after="80"/>
+      </w:pPr>
+      <w:r>
+        <w:rPr>
+          <w:b/>
+          <w:bCs/>
+          <w:sz w:val="22"/>
+          <w:szCs w:val="22"/>
+        </w:rPr>
+        <w:t xml:space="preserve">Grupos con tabla de clasificación: </w:t>
+      </w:r>
+      <w:r>
+        <w:rPr>
+          <w:sz w:val="22"/>
+          <w:szCs w:val="22"/>
+        </w:rPr>
+        <w:t xml:space="preserve">organiza retos o fases de entrenamiento con ranking entre clientes.</w:t>
       </w:r>
     </w:p>
     <w:p>

</xml_diff>